<commit_message>
Datos del desarrollador en un solo lugar
- src/config/contacto.json: nombre, rol, ciudad, teléfono, WhatsApp, correo
  y GitHub. Es la única fuente y alimenta app y documentos.
- Nueva pantalla /acerca: quién desarrolla el sistema, cómo contactarlo
  (WhatsApp con mensaje escrito y correo), qué incluye la demostración y
  qué no incluye. Accesible desde el menú lateral y el menú de usuario.
- El pie de página muestra el crédito con enlace a esa pantalla.
- Los generadores de Word leen ese mismo archivo: al llenarlo, el manual y
  la propuesta salen personalizados.

Co-Authored-By: Claude Opus 5 <noreply@anthropic.com>
</commit_message>
<xml_diff>
--- a/docs/Ronda - Manual de usuario.docx
+++ b/docs/Ronda - Manual de usuario.docx
@@ -226,7 +226,7 @@
                 <w:sz w:val="21"/>
                 <w:szCs w:val="21"/>
               </w:rPr>
-              <w:t xml:space="preserve">[Su nombre / empresa]</w:t>
+              <w:t xml:space="preserve">Richard Malagón</w:t>
             </w:r>
           </w:p>
         </w:tc>
@@ -272,7 +272,7 @@
                 <w:sz w:val="21"/>
                 <w:szCs w:val="21"/>
               </w:rPr>
-              <w:t xml:space="preserve">[teléfono] · [correo]</w:t>
+              <w:t xml:space="preserve">300 000 0000 · correo@ejemplo.com</w:t>
             </w:r>
           </w:p>
         </w:tc>
@@ -5505,7 +5505,7 @@
           <w:sz w:val="22"/>
           <w:szCs w:val="22"/>
         </w:rPr>
-        <w:t xml:space="preserve">Cualquier duda sobre el manejo del sistema, comuníquese con [Su nombre / empresa] — [teléfono] · [correo].</w:t>
+        <w:t xml:space="preserve">Cualquier duda sobre el manejo del sistema, comuníquese con Richard Malagón — 300 000 0000 · correo@ejemplo.com.</w:t>
       </w:r>
     </w:p>
     <w:sectPr>

</xml_diff>

<commit_message>
Datos de contacto reales y aclaración de que es una demostración
- Teléfono 311 575 9679 y correo malagonrichar13@gmail.com en la app y en
  los dos documentos de Word.
- "Acerca del sistema" abre con un aviso claro: es una muestra de cómo
  funcionaría el sistema en el bar, con datos de ejemplo, y explica qué
  cambia en la versión definitiva.
- Distintivo permanente "Demostración" en la barra superior, enlazado a
  esa explicación.
- Se retira la mención a equipos e internet del apartado "qué no incluye",
  tanto en la pantalla como en la propuesta.

Co-Authored-By: Claude Opus 5 <noreply@anthropic.com>
</commit_message>
<xml_diff>
--- a/docs/Ronda - Manual de usuario.docx
+++ b/docs/Ronda - Manual de usuario.docx
@@ -272,7 +272,7 @@
                 <w:sz w:val="21"/>
                 <w:szCs w:val="21"/>
               </w:rPr>
-              <w:t xml:space="preserve">300 000 0000 · correo@ejemplo.com</w:t>
+              <w:t xml:space="preserve">311 575 9679 · malagonrichar13@gmail.com</w:t>
             </w:r>
           </w:p>
         </w:tc>
@@ -5505,7 +5505,7 @@
           <w:sz w:val="22"/>
           <w:szCs w:val="22"/>
         </w:rPr>
-        <w:t xml:space="preserve">Cualquier duda sobre el manejo del sistema, comuníquese con Richard Malagón — 300 000 0000 · correo@ejemplo.com.</w:t>
+        <w:t xml:space="preserve">Cualquier duda sobre el manejo del sistema, comuníquese con Richard Malagón — 311 575 9679 · malagonrichar13@gmail.com.</w:t>
       </w:r>
     </w:p>
     <w:sectPr>

</xml_diff>